<commit_message>
Publish the owner-reviewed refreshed technology resume
</commit_message>
<xml_diff>
--- a/public/resume/Fatgezim_Zim_Bela_Technology_Resume.docx
+++ b/public/resume/Fatgezim_Zim_Bela_Technology_Resume.docx
@@ -22,10 +22,10 @@
       <w:pPr>
         <w:spacing w:after="140"/>
       </w:pPr>
-      <w:hyperlink r:id="rId9">
+      <w:hyperlink r:id="rId10">
         <w:r>
           <w:rPr>
-            <w:color w:val="006E71"/>
+            <w:color w:val="5836BB"/>
             <w:sz w:val="20"/>
           </w:rPr>
           <w:t>fatgezimbela1@gmail.com</w:t>
@@ -34,10 +34,10 @@
       <w:r>
         <w:t xml:space="preserve">   |   </w:t>
       </w:r>
-      <w:hyperlink r:id="rId10">
+      <w:hyperlink r:id="rId11">
         <w:r>
           <w:rPr>
-            <w:color w:val="006E71"/>
+            <w:color w:val="5836BB"/>
             <w:sz w:val="20"/>
           </w:rPr>
           <w:t>LinkedIn</w:t>
@@ -46,10 +46,10 @@
       <w:r>
         <w:t xml:space="preserve">   |   </w:t>
       </w:r>
-      <w:hyperlink r:id="rId11">
+      <w:hyperlink r:id="rId12">
         <w:r>
           <w:rPr>
-            <w:color w:val="006E71"/>
+            <w:color w:val="5836BB"/>
             <w:sz w:val="20"/>
           </w:rPr>
           <w:t>GitHub</w:t>
@@ -58,10 +58,10 @@
       <w:r>
         <w:t xml:space="preserve">   |   </w:t>
       </w:r>
-      <w:hyperlink r:id="rId12">
+      <w:hyperlink r:id="rId13">
         <w:r>
           <w:rPr>
-            <w:color w:val="006E71"/>
+            <w:color w:val="5836BB"/>
             <w:sz w:val="20"/>
           </w:rPr>
           <w:t>Portfolio</w:t>
@@ -320,6 +320,7 @@
       <w:r>
         <w:rPr>
           <w:b/>
+          <w:color w:val="000000"/>
         </w:rPr>
         <w:t>Fatgezim “Zim” Bela</w:t>
       </w:r>
@@ -342,10 +343,22 @@
       <w:r>
         <w:t xml:space="preserve">   </w:t>
       </w:r>
-      <w:hyperlink r:id="rId13">
+      <w:hyperlink r:id="rId14">
         <w:r>
           <w:rPr>
-            <w:color w:val="006E71"/>
+            <w:color w:val="5836BB"/>
+            <w:sz w:val="20"/>
+          </w:rPr>
+          <w:t>Live application</w:t>
+        </w:r>
+      </w:hyperlink>
+      <w:r>
+        <w:t xml:space="preserve"> | </w:t>
+      </w:r>
+      <w:hyperlink r:id="rId15">
+        <w:r>
+          <w:rPr>
+            <w:color w:val="5836BB"/>
             <w:sz w:val="20"/>
           </w:rPr>
           <w:t>Public source</w:t>
@@ -374,7 +387,7 @@
       </w:pPr>
       <w:r>
         <w:rPr>
-          <w:color w:val="455466"/>
+          <w:color w:val="625D70"/>
         </w:rPr>
         <w:t>Stack  Python, TypeScript, Pynapple, NeMoS, Stan, PyTorch, Plotly</w:t>
       </w:r>
@@ -389,10 +402,10 @@
       <w:r>
         <w:t xml:space="preserve">   </w:t>
       </w:r>
-      <w:hyperlink r:id="rId14">
+      <w:hyperlink r:id="rId16">
         <w:r>
           <w:rPr>
-            <w:color w:val="006E71"/>
+            <w:color w:val="5836BB"/>
             <w:sz w:val="20"/>
           </w:rPr>
           <w:t>Live application</w:t>
@@ -421,7 +434,7 @@
       </w:pPr>
       <w:r>
         <w:rPr>
-          <w:color w:val="455466"/>
+          <w:color w:val="625D70"/>
         </w:rPr>
         <w:t>Stack  React, TypeScript, Vite, Clerk, Stripe, Supabase, SheetJS, jsPDF, browser-local data processing</w:t>
       </w:r>
@@ -436,10 +449,10 @@
       <w:r>
         <w:t xml:space="preserve">   </w:t>
       </w:r>
-      <w:hyperlink r:id="rId15">
+      <w:hyperlink r:id="rId17">
         <w:r>
           <w:rPr>
-            <w:color w:val="006E71"/>
+            <w:color w:val="5836BB"/>
             <w:sz w:val="20"/>
           </w:rPr>
           <w:t>Live application</w:t>
@@ -468,7 +481,7 @@
       </w:pPr>
       <w:r>
         <w:rPr>
-          <w:color w:val="455466"/>
+          <w:color w:val="625D70"/>
         </w:rPr>
         <w:t>Stack  React, TypeScript, Vite, React Router, localStorage, GitHub Actions, Vercel</w:t>
       </w:r>
@@ -483,10 +496,22 @@
       <w:r>
         <w:t xml:space="preserve">   </w:t>
       </w:r>
-      <w:hyperlink r:id="rId16">
+      <w:hyperlink r:id="rId18">
         <w:r>
           <w:rPr>
-            <w:color w:val="006E71"/>
+            <w:color w:val="5836BB"/>
+            <w:sz w:val="20"/>
+          </w:rPr>
+          <w:t>Live application</w:t>
+        </w:r>
+      </w:hyperlink>
+      <w:r>
+        <w:t xml:space="preserve"> | </w:t>
+      </w:r>
+      <w:hyperlink r:id="rId19">
+        <w:r>
+          <w:rPr>
+            <w:color w:val="5836BB"/>
             <w:sz w:val="20"/>
           </w:rPr>
           <w:t>Public source</w:t>
@@ -515,7 +540,7 @@
       </w:pPr>
       <w:r>
         <w:rPr>
-          <w:color w:val="455466"/>
+          <w:color w:val="625D70"/>
         </w:rPr>
         <w:t>Stack  React, TypeScript, Vite, Zod, Storybook, Vitest, Playwright, accessibility testing, source and license metadata</w:t>
       </w:r>
@@ -550,7 +575,7 @@
       </w:pPr>
       <w:r>
         <w:rPr>
-          <w:color w:val="455466"/>
+          <w:color w:val="625D70"/>
         </w:rPr>
         <w:t>Stack  React, TypeScript, Express, Firebase Auth, Firestore, Zod, PDFKit, docx, Vitest</w:t>
       </w:r>
@@ -585,7 +610,7 @@
       </w:pPr>
       <w:r>
         <w:rPr>
-          <w:color w:val="455466"/>
+          <w:color w:val="625D70"/>
         </w:rPr>
         <w:t>Stack  HTML, CSS, JavaScript, localStorage, progress API integration</w:t>
       </w:r>
@@ -663,6 +688,7 @@
       </w:r>
     </w:p>
     <w:sectPr>
+      <w:footerReference w:type="default" r:id="rId9"/>
       <w:pgSz w:w="12240" w:h="15840"/>
       <w:pgMar w:top="706" w:right="864" w:bottom="706" w:left="864" w:header="720" w:footer="720" w:gutter="0"/>
       <w:cols w:space="720"/>
@@ -670,6 +696,25 @@
     </w:sectPr>
   </w:body>
 </w:document>
+</file>
+
+<file path=word/footer1.xml><?xml version="1.0" encoding="utf-8"?>
+<w:ftr xmlns:m="http://schemas.openxmlformats.org/officeDocument/2006/math" xmlns:mc="http://schemas.openxmlformats.org/markup-compatibility/2006" xmlns:mo="http://schemas.microsoft.com/office/mac/office/2008/main" xmlns:mv="urn:schemas-microsoft-com:mac:vml" xmlns:o="urn:schemas-microsoft-com:office:office" xmlns:r="http://schemas.openxmlformats.org/officeDocument/2006/relationships" xmlns:v="urn:schemas-microsoft-com:vml" xmlns:w10="urn:schemas-microsoft-com:office:word" xmlns:w14="http://schemas.microsoft.com/office/word/2010/wordml" xmlns:w="http://schemas.openxmlformats.org/wordprocessingml/2006/main" xmlns:wne="http://schemas.microsoft.com/office/word/2006/wordml" xmlns:wp14="http://schemas.microsoft.com/office/word/2010/wordprocessingDrawing" xmlns:wp="http://schemas.openxmlformats.org/drawingml/2006/wordprocessingDrawing" xmlns:wpc="http://schemas.microsoft.com/office/word/2010/wordprocessingCanvas" xmlns:wpg="http://schemas.microsoft.com/office/word/2010/wordprocessingGroup" xmlns:wpi="http://schemas.microsoft.com/office/word/2010/wordprocessingInk" xmlns:wps="http://schemas.microsoft.com/office/word/2010/wordprocessingShape" mc:Ignorable="w14 wp14">
+  <w:p>
+    <w:pPr>
+      <w:pStyle w:val="Footer"/>
+      <w:spacing w:before="0" w:after="0"/>
+    </w:pPr>
+    <w:r>
+      <w:rPr>
+        <w:rFonts w:ascii="Arial" w:hAnsi="Arial"/>
+        <w:color w:val="625D70"/>
+        <w:sz w:val="18"/>
+      </w:rPr>
+      <w:t>Fatgezim Zim Bela  |  Technology Resume</w:t>
+    </w:r>
+  </w:p>
+</w:ftr>
 </file>
 
 <file path=word/numbering.xml><?xml version="1.0" encoding="utf-8"?>
@@ -1036,11 +1081,11 @@
     <w:qFormat/>
     <w:rsid w:val="00FC693F"/>
     <w:pPr>
-      <w:spacing w:line="254" w:lineRule="auto" w:after="60"/>
+      <w:spacing w:line="259" w:lineRule="auto" w:after="60"/>
     </w:pPr>
     <w:rPr>
       <w:rFonts w:ascii="Arial" w:hAnsi="Arial"/>
-      <w:color w:val="19222F"/>
+      <w:color w:val="252137"/>
       <w:sz w:val="20"/>
     </w:rPr>
   </w:style>
@@ -1106,7 +1151,7 @@
       <w:rFonts w:asciiTheme="majorHAnsi" w:eastAsiaTheme="majorEastAsia" w:hAnsiTheme="majorHAnsi" w:cstheme="majorBidi" w:ascii="Arial" w:hAnsi="Arial"/>
       <w:b/>
       <w:bCs/>
-      <w:color w:val="006E71"/>
+      <w:color w:val="000000"/>
       <w:sz w:val="22"/>
       <w:szCs w:val="28"/>
     </w:rPr>
@@ -1130,7 +1175,7 @@
       <w:rFonts w:asciiTheme="majorHAnsi" w:eastAsiaTheme="majorEastAsia" w:hAnsiTheme="majorHAnsi" w:cstheme="majorBidi" w:ascii="Arial" w:hAnsi="Arial"/>
       <w:b/>
       <w:bCs/>
-      <w:color w:val="19222F"/>
+      <w:color w:val="000000"/>
       <w:sz w:val="21"/>
       <w:szCs w:val="26"/>
     </w:rPr>
@@ -1394,7 +1439,7 @@
       <w:color w:val="000000"/>
       <w:spacing w:val="5"/>
       <w:kern w:val="28"/>
-      <w:sz w:val="50"/>
+      <w:sz w:val="52"/>
       <w:szCs w:val="52"/>
     </w:rPr>
   </w:style>
@@ -1425,14 +1470,14 @@
       <w:numPr>
         <w:ilvl w:val="1"/>
       </w:numPr>
-      <w:spacing w:after="100"/>
+      <w:spacing w:after="120"/>
     </w:pPr>
     <w:rPr>
       <w:rFonts w:asciiTheme="majorHAnsi" w:eastAsiaTheme="majorEastAsia" w:hAnsiTheme="majorHAnsi" w:cstheme="majorBidi" w:ascii="Arial" w:hAnsi="Arial"/>
       <w:b/>
       <w:i w:val="0"/>
       <w:iCs/>
-      <w:color w:val="303E69"/>
+      <w:color w:val="000000"/>
       <w:spacing w:val="15"/>
       <w:sz w:val="22"/>
       <w:szCs w:val="24"/>

</xml_diff>

<commit_message>
Publish approved engineering resume and matching McVay experience
</commit_message>
<xml_diff>
--- a/public/resume/Fatgezim_Zim_Bela_Technology_Resume.docx
+++ b/public/resume/Fatgezim_Zim_Bela_Technology_Resume.docx
@@ -5,6 +5,7 @@
     <w:p>
       <w:pPr>
         <w:pStyle w:val="Title"/>
+        <w:spacing w:after="80"/>
       </w:pPr>
       <w:r>
         <w:t>Fatgezim “Zim” Bela</w:t>
@@ -13,67 +14,85 @@
     <w:p>
       <w:pPr>
         <w:pStyle w:val="Subtitle"/>
+        <w:spacing w:after="120"/>
       </w:pPr>
       <w:r>
-        <w:t>Founder and CTO · Software Engineering · Data and Scientific Systems</w:t>
+        <w:t>Software &amp; Data Engineer | Systems Integration | Technical Leadership</w:t>
       </w:r>
     </w:p>
     <w:p>
       <w:pPr>
-        <w:spacing w:after="140"/>
+        <w:spacing w:after="40" w:line="240" w:lineRule="exact"/>
       </w:pPr>
-      <w:hyperlink r:id="rId10">
+      <w:hyperlink r:id="rId9">
         <w:r>
           <w:rPr>
-            <w:color w:val="5836BB"/>
-            <w:sz w:val="20"/>
+            <w:color w:val="000000"/>
+            <w:rFonts w:ascii="Arial" w:hAnsi="Arial"/>
+            <w:sz w:val="19"/>
           </w:rPr>
           <w:t>fatgezimbela1@gmail.com</w:t>
         </w:r>
       </w:hyperlink>
       <w:r>
-        <w:t xml:space="preserve">   |   </w:t>
+        <w:rPr>
+          <w:sz w:val="19"/>
+        </w:rPr>
+        <w:t xml:space="preserve">  |  </w:t>
+      </w:r>
+      <w:hyperlink r:id="rId10">
+        <w:r>
+          <w:rPr>
+            <w:color w:val="000000"/>
+            <w:rFonts w:ascii="Arial" w:hAnsi="Arial"/>
+            <w:sz w:val="19"/>
+          </w:rPr>
+          <w:t>github.com/Fatgezimb</w:t>
+        </w:r>
+      </w:hyperlink>
+      <w:r>
+        <w:rPr>
+          <w:sz w:val="19"/>
+        </w:rPr>
+        <w:t xml:space="preserve">  |  </w:t>
       </w:r>
       <w:hyperlink r:id="rId11">
         <w:r>
           <w:rPr>
-            <w:color w:val="5836BB"/>
-            <w:sz w:val="20"/>
+            <w:color w:val="000000"/>
+            <w:rFonts w:ascii="Arial" w:hAnsi="Arial"/>
+            <w:sz w:val="19"/>
           </w:rPr>
-          <w:t>LinkedIn</w:t>
-        </w:r>
-      </w:hyperlink>
-      <w:r>
-        <w:t xml:space="preserve">   |   </w:t>
-      </w:r>
-      <w:hyperlink r:id="rId12">
-        <w:r>
-          <w:rPr>
-            <w:color w:val="5836BB"/>
-            <w:sz w:val="20"/>
-          </w:rPr>
-          <w:t>GitHub</w:t>
-        </w:r>
-      </w:hyperlink>
-      <w:r>
-        <w:t xml:space="preserve">   |   </w:t>
-      </w:r>
-      <w:hyperlink r:id="rId13">
-        <w:r>
-          <w:rPr>
-            <w:color w:val="5836BB"/>
-            <w:sz w:val="20"/>
-          </w:rPr>
-          <w:t>Portfolio</w:t>
+          <w:t>linkedin.com/in/fatgezimzimbela</w:t>
         </w:r>
       </w:hyperlink>
     </w:p>
     <w:p>
       <w:pPr>
-        <w:spacing w:after="100"/>
+        <w:spacing w:after="100" w:line="240" w:lineRule="exact"/>
+      </w:pPr>
+      <w:hyperlink r:id="rId12">
+        <w:r>
+          <w:rPr>
+            <w:color w:val="000000"/>
+            <w:rFonts w:ascii="Arial" w:hAnsi="Arial"/>
+            <w:sz w:val="19"/>
+          </w:rPr>
+          <w:t>fatgezimb.github.io/fatgezim-portfolio</w:t>
+        </w:r>
+      </w:hyperlink>
+    </w:p>
+    <w:p>
+      <w:pPr>
+        <w:pStyle w:val="Heading1"/>
       </w:pPr>
       <w:r>
-        <w:t>I lead technology and build software from workflow discovery through implementation and testing. My work spans typed web applications, Python and SQL data workflows, browser automation, and reproducible neuroscience software. A background in behavioral science and medical education helps me translate complex domain requirements into practical products.</w:t>
+        <w:t>Professional Summary</w:t>
+      </w:r>
+    </w:p>
+    <w:p>
+      <w:r>
+        <w:t>Python-focused engineer and Founder/CTO with experience in predictive algorithms, data workflows and application architecture. Programming since 2013, beginning with Python automation, analysis and web applications. Independently developed an algorithm under restricted-data access constraints and led hands-on product development from business requirements through implementation.</w:t>
       </w:r>
     </w:p>
     <w:p>
@@ -81,7 +100,7 @@
         <w:pStyle w:val="Heading1"/>
       </w:pPr>
       <w:r>
-        <w:t>Technical capabilities</w:t>
+        <w:t>Engineering Skills</w:t>
       </w:r>
     </w:p>
     <w:p>
@@ -92,10 +111,10 @@
         <w:rPr>
           <w:b/>
         </w:rPr>
-        <w:t xml:space="preserve">Software and product building  </w:t>
+        <w:t xml:space="preserve">Data and algorithms  </w:t>
       </w:r>
       <w:r>
-        <w:t>TypeScript and React, JavaScript and Next.js, Semantic HTML and CSS, Git and GitHub Actions, Vitest and Playwright, Accessible interface design, Testing and static deployment, Local-first data handling, Browser automation, Product workflow design, Responsible product prototyping</w:t>
+        <w:t>Python, SQL, data analysis, predictive modeling, validation and automation</w:t>
       </w:r>
     </w:p>
     <w:p>
@@ -106,10 +125,10 @@
         <w:rPr>
           <w:b/>
         </w:rPr>
-        <w:t xml:space="preserve">Data science and engineering  </w:t>
+        <w:t xml:space="preserve">Application development  </w:t>
       </w:r>
       <w:r>
-        <w:t>Python, SQL, Statistical analysis, Regression, classification, and clustering, Data visualization, Workflow automation, Operational reporting</w:t>
+        <w:t>JavaScript, TypeScript, React, Next.js, APIs and systems integration</w:t>
       </w:r>
     </w:p>
     <w:p>
@@ -120,10 +139,10 @@
         <w:rPr>
           <w:b/>
         </w:rPr>
-        <w:t xml:space="preserve">Project technologies  </w:t>
+        <w:t xml:space="preserve">Architecture and delivery  </w:t>
       </w:r>
       <w:r>
-        <w:t>Pynapple, NeMoS, Stan, PyTorch, Plotly, Zod, Vitest, Express, Firebase Auth, Firestore, PDFKit, docx</w:t>
+        <w:t>Requirements analysis, data modeling, authentication, Git and testing</w:t>
       </w:r>
     </w:p>
     <w:p>
@@ -131,183 +150,212 @@
         <w:pStyle w:val="Heading1"/>
       </w:pPr>
       <w:r>
-        <w:t>Experience</w:t>
+        <w:t>Relevant Engineering and Clinical Experience</w:t>
       </w:r>
     </w:p>
     <w:p>
       <w:pPr>
         <w:pStyle w:val="Heading2"/>
+        <w:tabs>
+          <w:tab w:pos="10368" w:val="right"/>
+        </w:tabs>
+        <w:spacing w:before="120"/>
       </w:pPr>
+      <w:r/>
       <w:r>
-        <w:t>Founder and Chief Technology Officer | Create 13 Group</w:t>
+        <w:rPr>
+          <w:b/>
+        </w:rPr>
+        <w:t>Data Engineer</w:t>
+      </w:r>
+      <w:r>
+        <w:rPr>
+          <w:sz w:val="19"/>
+        </w:rPr>
+        <w:tab/>
+        <w:t>October 2022 - January 2023</w:t>
       </w:r>
     </w:p>
     <w:p>
       <w:pPr>
-        <w:spacing w:after="40"/>
+        <w:keepNext/>
+        <w:spacing w:after="60"/>
       </w:pPr>
       <w:r>
+        <w:t>The McVay Company, Inc.</w:t>
+      </w:r>
+    </w:p>
+    <w:p>
+      <w:pPr>
+        <w:pStyle w:val="ListBullet"/>
+      </w:pPr>
+      <w:r>
+        <w:t>Independently designed and implemented a custom adaptation of Dijkstra’s shortest-path algorithm for large-scale health-related data analysis on a Department of Defense project.</w:t>
+      </w:r>
+    </w:p>
+    <w:p>
+      <w:pPr>
+        <w:pStyle w:val="ListBullet"/>
+      </w:pPr>
+      <w:r>
+        <w:t>Created synthetic development and test datasets and established initial validation without access to restricted operational data.</w:t>
+      </w:r>
+    </w:p>
+    <w:p>
+      <w:pPr>
+        <w:pStyle w:val="ListBullet"/>
+      </w:pPr>
+      <w:r>
+        <w:t>Transferred the solution for team testing on operational data; colleagues reported processing millions of data points in seconds and narrowing results to approximately 12 records for manual review.</w:t>
+      </w:r>
+    </w:p>
+    <w:p>
+      <w:pPr>
+        <w:pStyle w:val="Heading2"/>
+        <w:tabs>
+          <w:tab w:pos="10368" w:val="right"/>
+        </w:tabs>
+        <w:spacing w:before="120"/>
+      </w:pPr>
+      <w:r/>
+      <w:r>
         <w:rPr>
-          <w:i/>
+          <w:b/>
         </w:rPr>
+        <w:t>Founder and Chief Technology Officer</w:t>
+      </w:r>
+      <w:r>
+        <w:rPr>
+          <w:sz w:val="19"/>
+        </w:rPr>
+        <w:tab/>
         <w:t>2018 - Present</w:t>
       </w:r>
     </w:p>
     <w:p>
       <w:pPr>
-        <w:spacing w:after="40"/>
+        <w:keepNext/>
+        <w:spacing w:after="60"/>
       </w:pPr>
       <w:r>
-        <w:t>Lead technology direction and hands-on software development, translating business requirements into product architecture and implementation priorities.</w:t>
+        <w:t>Create 13 Group</w:t>
       </w:r>
     </w:p>
     <w:p>
       <w:pPr>
-        <w:spacing w:after="20"/>
-        <w:ind w:left="144" w:hanging="144"/>
+        <w:pStyle w:val="ListBullet"/>
       </w:pPr>
       <w:r>
-        <w:t>• Own technical scoping, integration decisions, interface development, and release planning.</w:t>
+        <w:t>Co-founded a technology and business development company; lead technical requirements, architecture, technology selection and hands-on implementation.</w:t>
       </w:r>
     </w:p>
     <w:p>
       <w:pPr>
-        <w:spacing w:after="20"/>
-        <w:ind w:left="144" w:hanging="144"/>
+        <w:pStyle w:val="ListBullet"/>
       </w:pPr>
       <w:r>
-        <w:t>• Work directly in the codebase while coordinating product requirements and iterative delivery.</w:t>
+        <w:t>Led architecture and development of a consumer-brand commerce platform in 2026, connecting responsive shopping interfaces, product and inventory management, cart workflows and administration.</w:t>
+      </w:r>
+    </w:p>
+    <w:p>
+      <w:pPr>
+        <w:pStyle w:val="ListBullet"/>
+      </w:pPr>
+      <w:r>
+        <w:t>Defined database, authentication and payment-integration architecture using TypeScript, React, Next.js, Vercel and Stripe; design workflow automations and external-service integrations.</w:t>
       </w:r>
     </w:p>
     <w:p>
       <w:pPr>
         <w:pStyle w:val="Heading2"/>
+        <w:tabs>
+          <w:tab w:pos="10368" w:val="right"/>
+        </w:tabs>
+        <w:spacing w:before="120"/>
       </w:pPr>
-      <w:r>
-        <w:t>Founder and Chief Technology Officer | NeuroPath LLC</w:t>
-      </w:r>
-    </w:p>
-    <w:p>
-      <w:pPr>
-        <w:spacing w:after="40"/>
-      </w:pPr>
+      <w:r/>
       <w:r>
         <w:rPr>
-          <w:i/>
+          <w:b/>
         </w:rPr>
+        <w:t>Founder and Chief Technology Officer</w:t>
+      </w:r>
+      <w:r>
+        <w:rPr>
+          <w:sz w:val="19"/>
+        </w:rPr>
+        <w:tab/>
         <w:t>2026 - Present</w:t>
       </w:r>
     </w:p>
     <w:p>
       <w:pPr>
-        <w:spacing w:after="40"/>
+        <w:keepNext/>
+        <w:spacing w:after="60"/>
       </w:pPr>
       <w:r>
-        <w:t>Lead product architecture and engineering for behavioral-health learning and operational software; co-build Bela Data Lab products with Meili Bela.</w:t>
+        <w:t>NeuroPath LLC</w:t>
       </w:r>
     </w:p>
     <w:p>
       <w:pPr>
-        <w:spacing w:after="20"/>
-        <w:ind w:left="144" w:hanging="144"/>
+        <w:pStyle w:val="ListBullet"/>
       </w:pPr>
       <w:r>
-        <w:t>• Translate clinical and operational workflows into structured data, review states, and usable interfaces.</w:t>
+        <w:t>Co-build Bela Behavior Data Lab with Meili Bela, turning appointment exports into browser-local dashboards, follow-up views and reports.</w:t>
       </w:r>
     </w:p>
     <w:p>
       <w:pPr>
-        <w:spacing w:after="20"/>
-        <w:ind w:left="144" w:hanging="144"/>
+        <w:pStyle w:val="ListBullet"/>
       </w:pPr>
       <w:r>
-        <w:t>• Build browser-local analytics, education tools, and workflow automation with explicit data boundaries.</w:t>
+        <w:t>Translate clinical and learning requirements into structured records, review workflows and operational software for a behavioral-health practice.</w:t>
       </w:r>
     </w:p>
     <w:p>
       <w:pPr>
         <w:pStyle w:val="Heading2"/>
+        <w:tabs>
+          <w:tab w:pos="10368" w:val="right"/>
+        </w:tabs>
+        <w:spacing w:before="120"/>
       </w:pPr>
+      <w:r/>
       <w:r>
-        <w:t>Data Engineer | The McVay Company, Inc.</w:t>
+        <w:rPr>
+          <w:b/>
+        </w:rPr>
+        <w:t>Board Certified Behavior Analyst</w:t>
+      </w:r>
+      <w:r>
+        <w:rPr>
+          <w:sz w:val="19"/>
+        </w:rPr>
+        <w:tab/>
+        <w:t>2025 - Present</w:t>
       </w:r>
     </w:p>
     <w:p>
       <w:pPr>
-        <w:spacing w:after="40"/>
+        <w:keepNext/>
+        <w:spacing w:after="60"/>
       </w:pPr>
       <w:r>
-        <w:rPr>
-          <w:i/>
-        </w:rPr>
-        <w:t>October 2022 - January 2023</w:t>
+        <w:t>Clinical practice</w:t>
       </w:r>
     </w:p>
     <w:p>
       <w:pPr>
-        <w:spacing w:after="40"/>
+        <w:pStyle w:val="ListBullet"/>
       </w:pPr>
       <w:r>
-        <w:t>Contributed to data-engineering workflows at The McVay Company, Inc.</w:t>
+        <w:t>Use behavioral data to guide individualized programming, caregiver collaboration and supervised RBT implementation.</w:t>
       </w:r>
     </w:p>
     <w:p>
       <w:pPr>
-        <w:pStyle w:val="Heading2"/>
-      </w:pPr>
-      <w:r>
-        <w:t>Board Certified Behavior Analyst</w:t>
-      </w:r>
-    </w:p>
-    <w:p>
-      <w:pPr>
-        <w:spacing w:after="40"/>
-      </w:pPr>
-      <w:r>
-        <w:rPr>
-          <w:i/>
-        </w:rPr>
-        <w:t>Since 2025</w:t>
-      </w:r>
-    </w:p>
-    <w:p>
-      <w:pPr>
-        <w:spacing w:after="40"/>
-      </w:pPr>
-      <w:r>
-        <w:t>Behavior-analytic practice centered on assessment, individualized programming, skill development, caregiver collaboration, and team support.</w:t>
-      </w:r>
-    </w:p>
-    <w:p>
-      <w:pPr>
-        <w:spacing w:after="20"/>
-        <w:ind w:left="144" w:hanging="144"/>
-      </w:pPr>
-      <w:r>
-        <w:t>• Functional behavior assessment and behavior intervention planning</w:t>
-      </w:r>
-    </w:p>
-    <w:p>
-      <w:pPr>
-        <w:spacing w:after="20"/>
-        <w:ind w:left="144" w:hanging="144"/>
-      </w:pPr>
-      <w:r>
-        <w:t>• Skill-acquisition programming using evidence-based teaching approaches</w:t>
-      </w:r>
-    </w:p>
-    <w:p>
-      <w:pPr>
-        <w:spacing w:after="20"/>
-        <w:ind w:left="144" w:hanging="144"/>
-      </w:pPr>
-      <w:r>
-        <w:t>• Caregiver collaboration and RBT supervision</w:t>
-      </w:r>
-    </w:p>
-    <w:p>
-      <w:pPr>
-        <w:spacing w:after="0"/>
+        <w:spacing w:after="0" w:before="0"/>
       </w:pPr>
       <w:r>
         <w:br w:type="page"/>
@@ -315,239 +363,16 @@
     </w:p>
     <w:p>
       <w:pPr>
-        <w:spacing w:after="40"/>
-      </w:pPr>
-      <w:r>
-        <w:rPr>
-          <w:b/>
-          <w:color w:val="000000"/>
-        </w:rPr>
-        <w:t>Fatgezim “Zim” Bela</w:t>
-      </w:r>
-    </w:p>
-    <w:p>
-      <w:pPr>
         <w:pStyle w:val="Heading1"/>
       </w:pPr>
       <w:r>
-        <w:t>Selected engineering projects</w:t>
+        <w:t>Selected Engineering Projects</w:t>
       </w:r>
     </w:p>
     <w:p>
       <w:pPr>
         <w:pStyle w:val="Heading2"/>
-      </w:pPr>
-      <w:r>
-        <w:t>NeuroStack Explorer</w:t>
-      </w:r>
-      <w:r>
-        <w:t xml:space="preserve">   </w:t>
-      </w:r>
-      <w:hyperlink r:id="rId14">
-        <w:r>
-          <w:rPr>
-            <w:color w:val="5836BB"/>
-            <w:sz w:val="20"/>
-          </w:rPr>
-          <w:t>Live application</w:t>
-        </w:r>
-      </w:hyperlink>
-      <w:r>
-        <w:t xml:space="preserve"> | </w:t>
-      </w:r>
-      <w:hyperlink r:id="rId15">
-        <w:r>
-          <w:rPr>
-            <w:color w:val="5836BB"/>
-            <w:sz w:val="20"/>
-          </w:rPr>
-          <w:t>Public source</w:t>
-        </w:r>
-      </w:hyperlink>
-    </w:p>
-    <w:p>
-      <w:pPr>
-        <w:spacing w:after="20"/>
-      </w:pPr>
-      <w:r>
-        <w:t>Creator and Scientific Software Developer | Open-source scientific portfolio</w:t>
-      </w:r>
-    </w:p>
-    <w:p>
-      <w:pPr>
-        <w:spacing w:after="20"/>
-      </w:pPr>
-      <w:r>
-        <w:t>An open-source neuroscience software explorer that turns a checksum-verified NWB dataset into readable, interactive views across data, models, and reproducible artifacts.</w:t>
-      </w:r>
-    </w:p>
-    <w:p>
-      <w:pPr>
-        <w:spacing w:after="60"/>
-      </w:pPr>
-      <w:r>
-        <w:rPr>
-          <w:color w:val="625D70"/>
-        </w:rPr>
-        <w:t>Stack  Python, TypeScript, Pynapple, NeMoS, Stan, PyTorch, Plotly</w:t>
-      </w:r>
-    </w:p>
-    <w:p>
-      <w:pPr>
-        <w:pStyle w:val="Heading2"/>
-      </w:pPr>
-      <w:r>
-        <w:t>Bela Behavior Data Lab</w:t>
-      </w:r>
-      <w:r>
-        <w:t xml:space="preserve">   </w:t>
-      </w:r>
-      <w:hyperlink r:id="rId16">
-        <w:r>
-          <w:rPr>
-            <w:color w:val="5836BB"/>
-            <w:sz w:val="20"/>
-          </w:rPr>
-          <w:t>Live application</w:t>
-        </w:r>
-      </w:hyperlink>
-    </w:p>
-    <w:p>
-      <w:pPr>
-        <w:spacing w:after="20"/>
-      </w:pPr>
-      <w:r>
-        <w:t>Co-founder and Co-builder | Live operations product</w:t>
-      </w:r>
-    </w:p>
-    <w:p>
-      <w:pPr>
-        <w:spacing w:after="20"/>
-      </w:pPr>
-      <w:r>
-        <w:t>A browser-local operations workspace that turns Rethink appointment exports into reviewable dashboards, follow-up views, and report-ready outputs.</w:t>
-      </w:r>
-    </w:p>
-    <w:p>
-      <w:pPr>
-        <w:spacing w:after="60"/>
-      </w:pPr>
-      <w:r>
-        <w:rPr>
-          <w:color w:val="625D70"/>
-        </w:rPr>
-        <w:t>Stack  React, TypeScript, Vite, Clerk, Stripe, Supabase, SheetJS, jsPDF, browser-local data processing</w:t>
-      </w:r>
-    </w:p>
-    <w:p>
-      <w:pPr>
-        <w:pStyle w:val="Heading2"/>
-      </w:pPr>
-      <w:r>
-        <w:t>RBT Practice Hub</w:t>
-      </w:r>
-      <w:r>
-        <w:t xml:space="preserve">   </w:t>
-      </w:r>
-      <w:hyperlink r:id="rId17">
-        <w:r>
-          <w:rPr>
-            <w:color w:val="5836BB"/>
-            <w:sz w:val="20"/>
-          </w:rPr>
-          <w:t>Live application</w:t>
-        </w:r>
-      </w:hyperlink>
-    </w:p>
-    <w:p>
-      <w:pPr>
-        <w:spacing w:after="20"/>
-      </w:pPr>
-      <w:r>
-        <w:t>Founder and Product Builder | Live study resource</w:t>
-      </w:r>
-    </w:p>
-    <w:p>
-      <w:pPr>
-        <w:spacing w:after="20"/>
-      </w:pPr>
-      <w:r>
-        <w:t>A static study application that organizes practice across the 19 RBT Initial Competency Assessment tasks with original review materials and local progress tracking.</w:t>
-      </w:r>
-    </w:p>
-    <w:p>
-      <w:pPr>
-        <w:spacing w:after="60"/>
-      </w:pPr>
-      <w:r>
-        <w:rPr>
-          <w:color w:val="625D70"/>
-        </w:rPr>
-        <w:t>Stack  React, TypeScript, Vite, React Router, localStorage, GitHub Actions, Vercel</w:t>
-      </w:r>
-    </w:p>
-    <w:p>
-      <w:pPr>
-        <w:pStyle w:val="Heading2"/>
-      </w:pPr>
-      <w:r>
-        <w:t>StepSpark</w:t>
-      </w:r>
-      <w:r>
-        <w:t xml:space="preserve">   </w:t>
-      </w:r>
-      <w:hyperlink r:id="rId18">
-        <w:r>
-          <w:rPr>
-            <w:color w:val="5836BB"/>
-            <w:sz w:val="20"/>
-          </w:rPr>
-          <w:t>Live application</w:t>
-        </w:r>
-      </w:hyperlink>
-      <w:r>
-        <w:t xml:space="preserve"> | </w:t>
-      </w:r>
-      <w:hyperlink r:id="rId19">
-        <w:r>
-          <w:rPr>
-            <w:color w:val="5836BB"/>
-            <w:sz w:val="20"/>
-          </w:rPr>
-          <w:t>Public source</w:t>
-        </w:r>
-      </w:hyperlink>
-    </w:p>
-    <w:p>
-      <w:pPr>
-        <w:spacing w:after="20"/>
-      </w:pPr>
-      <w:r>
-        <w:t>Creator and Product Builder | Medical-learning prototype</w:t>
-      </w:r>
-    </w:p>
-    <w:p>
-      <w:pPr>
-        <w:spacing w:after="20"/>
-      </w:pPr>
-      <w:r>
-        <w:t>A visual-learning prototype for rapid USMLE Step 1 recall, structured around source-aware cards, progressive disclosure, and learner-controlled review states.</w:t>
-      </w:r>
-    </w:p>
-    <w:p>
-      <w:pPr>
-        <w:spacing w:after="60"/>
-      </w:pPr>
-      <w:r>
-        <w:rPr>
-          <w:color w:val="625D70"/>
-        </w:rPr>
-        <w:t>Stack  React, TypeScript, Vite, Zod, Storybook, Vitest, Playwright, accessibility testing, source and license metadata</w:t>
-      </w:r>
-    </w:p>
-    <w:p>
-      <w:pPr>
-        <w:pStyle w:val="Heading2"/>
+        <w:spacing w:before="120"/>
       </w:pPr>
       <w:r>
         <w:t>Clinical Assessment Portal</w:t>
@@ -555,112 +380,160 @@
     </w:p>
     <w:p>
       <w:pPr>
-        <w:spacing w:after="20"/>
+        <w:keepNext/>
+        <w:spacing w:after="80"/>
       </w:pPr>
       <w:r>
-        <w:t>Product Builder and Developer | Private implementation; locally tested with synthetic records</w:t>
+        <w:rPr>
+          <w:sz w:val="19"/>
+        </w:rPr>
+        <w:t>Private implementation tested with synthetic records | React, TypeScript, Express, Firebase</w:t>
       </w:r>
     </w:p>
     <w:p>
       <w:pPr>
-        <w:spacing w:after="20"/>
+        <w:pStyle w:val="ListBullet"/>
       </w:pPr>
       <w:r>
-        <w:t>Implemented practice-scoped assessment workflows with ownership and edit permissions, version checks, clinician review and signatures, and server-generated PDF/DOCX reports.</w:t>
+        <w:t>Implemented practice-scoped authorization and record ownership, with explicit edit permissions.</w:t>
       </w:r>
     </w:p>
     <w:p>
       <w:pPr>
-        <w:spacing w:after="60"/>
+        <w:pStyle w:val="ListBullet"/>
       </w:pPr>
       <w:r>
-        <w:rPr>
-          <w:color w:val="625D70"/>
-        </w:rPr>
-        <w:t>Stack  React, TypeScript, Express, Firebase Auth, Firestore, Zod, PDFKit, docx, Vitest</w:t>
+        <w:t>Added version checks, clinician review and signatures, and server-generated PDF and DOCX reports.</w:t>
+      </w:r>
+    </w:p>
+    <w:p>
+      <w:pPr>
+        <w:pStyle w:val="ListBullet"/>
+      </w:pPr>
+      <w:r>
+        <w:t>Integrated Firebase authentication and Firestore persistence with Zod validation and Vitest testing.</w:t>
       </w:r>
     </w:p>
     <w:p>
       <w:pPr>
         <w:pStyle w:val="Heading2"/>
+        <w:tabs>
+          <w:tab w:pos="10368" w:val="right"/>
+        </w:tabs>
+        <w:spacing w:before="120"/>
       </w:pPr>
       <w:r>
-        <w:t>USMLE Sprint</w:t>
+        <w:t>Relay Commissioning Readiness</w:t>
+      </w:r>
+      <w:r>
+        <w:tab/>
+      </w:r>
+      <w:hyperlink r:id="rId13">
+        <w:r>
+          <w:rPr>
+            <w:color w:val="000000"/>
+            <w:rFonts w:ascii="Arial" w:hAnsi="Arial"/>
+            <w:sz w:val="18"/>
+          </w:rPr>
+          <w:t>View project</w:t>
+        </w:r>
+      </w:hyperlink>
+    </w:p>
+    <w:p>
+      <w:pPr>
+        <w:keepNext/>
+        <w:spacing w:after="80"/>
+      </w:pPr>
+      <w:r>
+        <w:rPr>
+          <w:sz w:val="19"/>
+        </w:rPr>
+        <w:t>Independent engineering prototype with fictional commissioning records | React, JavaScript</w:t>
       </w:r>
     </w:p>
     <w:p>
       <w:pPr>
-        <w:spacing w:after="20"/>
+        <w:pStyle w:val="ListBullet"/>
       </w:pPr>
       <w:r>
-        <w:t>Product Builder and Developer | Account-gated learning application; local implementation inspected</w:t>
+        <w:t>Modeled acceptance as a dependency chain, tying evidence to the current asset revision and prerequisite event IDs.</w:t>
       </w:r>
     </w:p>
     <w:p>
       <w:pPr>
-        <w:spacing w:after="20"/>
+        <w:pStyle w:val="ListBullet"/>
       </w:pPr>
       <w:r>
-        <w:t>Built a study workspace with progress dashboards, daily planning, question-session controls, review history, and import/export workflows using JavaScript and browser persistence.</w:t>
+        <w:t>Derived readiness from the complete chain; revision changes and replacement test records invalidate dependent approvals.</w:t>
       </w:r>
     </w:p>
     <w:p>
       <w:pPr>
-        <w:spacing w:after="60"/>
+        <w:pStyle w:val="ListBullet"/>
       </w:pPr>
       <w:r>
-        <w:rPr>
-          <w:color w:val="625D70"/>
-        </w:rPr>
-        <w:t>Stack  HTML, CSS, JavaScript, localStorage, progress API integration</w:t>
+        <w:t>Covered blocked acceptance, revision propagation and persistence recovery with 10 domain tests; added JSON turnover exports.</w:t>
       </w:r>
     </w:p>
     <w:p>
       <w:pPr>
-        <w:pStyle w:val="Heading1"/>
+        <w:pStyle w:val="Heading2"/>
+        <w:tabs>
+          <w:tab w:pos="10368" w:val="right"/>
+        </w:tabs>
+        <w:spacing w:before="120"/>
       </w:pPr>
       <w:r>
-        <w:t>Education and credentials</w:t>
+        <w:t>Grid Forecast Lab</w:t>
+      </w:r>
+      <w:r>
+        <w:tab/>
+      </w:r>
+      <w:hyperlink r:id="rId14">
+        <w:r>
+          <w:rPr>
+            <w:color w:val="000000"/>
+            <w:rFonts w:ascii="Arial" w:hAnsi="Arial"/>
+            <w:sz w:val="18"/>
+          </w:rPr>
+          <w:t>View project</w:t>
+        </w:r>
+      </w:hyperlink>
+    </w:p>
+    <w:p>
+      <w:pPr>
+        <w:keepNext/>
+        <w:spacing w:after="80"/>
+      </w:pPr>
+      <w:r>
+        <w:rPr>
+          <w:sz w:val="19"/>
+        </w:rPr>
+        <w:t>Historical demand forecasting benchmark | Python, scikit-learn, React</w:t>
       </w:r>
     </w:p>
     <w:p>
       <w:pPr>
-        <w:spacing w:after="40"/>
+        <w:pStyle w:val="ListBullet"/>
       </w:pPr>
       <w:r>
-        <w:t>Doctor of Medicine Candidate | Ross University School of Medicine | Expected 2028</w:t>
+        <w:t>Built a day-ahead forecast pipeline with expanding chronological validation, separate interval calibration and held-out 2017 evaluation.</w:t>
       </w:r>
     </w:p>
     <w:p>
       <w:pPr>
-        <w:spacing w:after="40"/>
+        <w:pStyle w:val="ListBullet"/>
       </w:pPr>
       <w:r>
-        <w:t>M.Ed. in Special Education | George Mason University | 2020</w:t>
+        <w:t>Measured 1,854 MW mean absolute error over 8,732 test hours, 14.4% below the prior-day baseline.</w:t>
       </w:r>
     </w:p>
     <w:p>
       <w:pPr>
-        <w:spacing w:after="40"/>
+        <w:pStyle w:val="ListBullet"/>
       </w:pPr>
       <w:r>
-        <w:t>Graduate Certificate in Applied Behavior Analysis | George Mason University | 2020</w:t>
-      </w:r>
-    </w:p>
-    <w:p>
-      <w:pPr>
-        <w:spacing w:after="40"/>
-      </w:pPr>
-      <w:r>
-        <w:t>B.S. in Neuroscience | George Mason University | 2017</w:t>
-      </w:r>
-    </w:p>
-    <w:p>
-      <w:pPr>
-        <w:spacing w:after="60"/>
-      </w:pPr>
-      <w:r>
-        <w:t>Board Certified Behavior Analyst (BCBA) | Licensed Behavior Analyst - Virginia | Licensed Behavior Analyst - North Carolina | Licensed Behavior Analyst - New York</w:t>
+        <w:t>Extended a credited Rob Mulla Kaggle exercise with a reproducible pipeline, executed notebook, tests and interactive forecast replay.</w:t>
       </w:r>
     </w:p>
     <w:p>
@@ -673,10 +546,34 @@
     </w:p>
     <w:p>
       <w:pPr>
-        <w:spacing w:after="20"/>
+        <w:pStyle w:val="Heading2"/>
+        <w:tabs>
+          <w:tab w:pos="10368" w:val="right"/>
+        </w:tabs>
       </w:pPr>
       <w:r>
-        <w:t>Computational Neuroscience: Tracing Neurons from the Fruit Fly Larva | Centers for Neural Informatics, Structures &amp; Plasticity, George Mason University</w:t>
+        <w:t>Computational Neuroscience Research | George Mason University</w:t>
+      </w:r>
+      <w:r>
+        <w:tab/>
+      </w:r>
+      <w:hyperlink r:id="rId15">
+        <w:r>
+          <w:rPr>
+            <w:color w:val="000000"/>
+            <w:rFonts w:ascii="Arial" w:hAnsi="Arial"/>
+            <w:sz w:val="18"/>
+          </w:rPr>
+          <w:t>Poster</w:t>
+        </w:r>
+      </w:hyperlink>
+    </w:p>
+    <w:p>
+      <w:pPr>
+        <w:spacing w:after="60"/>
+      </w:pPr>
+      <w:r>
+        <w:t>Co-author with Sumit Nanda and Giorgio A. Ascoli on Tracing Neurons from the Fruit Fly Larva. Contributed to a collaborative workflow documenting image-channel processing, stitching, neuronal tracing and vectorized-tree reconstruction.</w:t>
       </w:r>
     </w:p>
     <w:p>
@@ -684,13 +581,101 @@
         <w:spacing w:after="40"/>
       </w:pPr>
       <w:r>
-        <w:t>Methods  Fiji/ImageJ, Image-channel splitting, Signal combination, Vaa3D raw preparation, Vaa3D image stitching, NeuTube tracing, Vectorized-tree reconstruction</w:t>
+        <w:t>Methods: Fiji/ImageJ, Vaa3D and NeuTube</w:t>
+      </w:r>
+    </w:p>
+    <w:p>
+      <w:pPr>
+        <w:pStyle w:val="Heading1"/>
+      </w:pPr>
+      <w:r>
+        <w:t>Education</w:t>
+      </w:r>
+    </w:p>
+    <w:p>
+      <w:pPr>
+        <w:spacing w:after="60"/>
+      </w:pPr>
+      <w:r>
+        <w:rPr>
+          <w:b/>
+        </w:rPr>
+        <w:t>Doctor of Medicine Candidate</w:t>
+      </w:r>
+      <w:r>
+        <w:t xml:space="preserve"> | Ross University School of Medicine | Expected 2028</w:t>
+      </w:r>
+    </w:p>
+    <w:p>
+      <w:pPr>
+        <w:spacing w:after="60"/>
+      </w:pPr>
+      <w:r>
+        <w:rPr>
+          <w:b/>
+        </w:rPr>
+        <w:t>M.Ed. in Special Education</w:t>
+      </w:r>
+      <w:r>
+        <w:t xml:space="preserve"> | George Mason University | 2020</w:t>
+      </w:r>
+    </w:p>
+    <w:p>
+      <w:pPr>
+        <w:spacing w:after="60"/>
+      </w:pPr>
+      <w:r>
+        <w:rPr>
+          <w:b/>
+        </w:rPr>
+        <w:t>Graduate Certificate in Applied Behavior Analysis</w:t>
+      </w:r>
+      <w:r>
+        <w:t xml:space="preserve"> | George Mason University | 2020</w:t>
+      </w:r>
+    </w:p>
+    <w:p>
+      <w:pPr>
+        <w:spacing w:after="60"/>
+      </w:pPr>
+      <w:r>
+        <w:rPr>
+          <w:b/>
+        </w:rPr>
+        <w:t>B.S. in Neuroscience</w:t>
+      </w:r>
+      <w:r>
+        <w:t xml:space="preserve"> | George Mason University | 2017</w:t>
+      </w:r>
+    </w:p>
+    <w:p>
+      <w:pPr>
+        <w:pStyle w:val="Heading1"/>
+      </w:pPr>
+      <w:r>
+        <w:t>Professional Credentials</w:t>
+      </w:r>
+    </w:p>
+    <w:p>
+      <w:pPr>
+        <w:spacing w:after="40"/>
+      </w:pPr>
+      <w:r>
+        <w:t>Board Certified Behavior Analyst (BCBA).</w:t>
+      </w:r>
+    </w:p>
+    <w:p>
+      <w:pPr>
+        <w:spacing w:after="40"/>
+      </w:pPr>
+      <w:r>
+        <w:t>Licensed Behavior Analyst in Virginia, North Carolina and New York.</w:t>
       </w:r>
     </w:p>
     <w:sectPr>
-      <w:footerReference w:type="default" r:id="rId9"/>
+      <w:footerReference w:type="default" r:id="rId16"/>
       <w:pgSz w:w="12240" w:h="15840"/>
-      <w:pgMar w:top="706" w:right="864" w:bottom="706" w:left="864" w:header="720" w:footer="720" w:gutter="0"/>
+      <w:pgMar w:top="835" w:right="936" w:bottom="835" w:left="936" w:header="317" w:footer="346" w:gutter="0"/>
       <w:cols w:space="720"/>
       <w:docGrid w:linePitch="360"/>
     </w:sectPr>
@@ -703,16 +688,37 @@
   <w:p>
     <w:pPr>
       <w:pStyle w:val="Footer"/>
-      <w:spacing w:before="0" w:after="0"/>
+      <w:tabs>
+        <w:tab w:pos="10368" w:val="right"/>
+      </w:tabs>
+      <w:spacing w:after="0" w:line="240" w:lineRule="auto"/>
+      <w:jc w:val="right"/>
     </w:pPr>
     <w:r>
       <w:rPr>
-        <w:rFonts w:ascii="Arial" w:hAnsi="Arial"/>
-        <w:color w:val="625D70"/>
-        <w:sz w:val="18"/>
-      </w:rPr>
-      <w:t>Fatgezim Zim Bela  |  Technology Resume</w:t>
+        <w:color w:val="555555"/>
+        <w:sz w:val="16"/>
+      </w:rPr>
+      <w:t xml:space="preserve">Fatgezim Zim Bela  |  </w:t>
     </w:r>
+    <w:r>
+      <w:rPr>
+        <w:sz w:val="16"/>
+      </w:rPr>
+    </w:r>
+    <w:fldSimple w:instr="PAGE"/>
+    <w:r>
+      <w:rPr>
+        <w:sz w:val="16"/>
+      </w:rPr>
+      <w:t xml:space="preserve"> / </w:t>
+    </w:r>
+    <w:r>
+      <w:rPr>
+        <w:sz w:val="16"/>
+      </w:rPr>
+    </w:r>
+    <w:fldSimple w:instr="NUMPAGES"/>
   </w:p>
 </w:ftr>
 </file>
@@ -1081,12 +1087,12 @@
     <w:qFormat/>
     <w:rsid w:val="00FC693F"/>
     <w:pPr>
-      <w:spacing w:line="259" w:lineRule="auto" w:after="60"/>
+      <w:spacing w:line="284" w:lineRule="exact" w:after="60"/>
     </w:pPr>
     <w:rPr>
       <w:rFonts w:ascii="Arial" w:hAnsi="Arial"/>
-      <w:color w:val="252137"/>
-      <w:sz w:val="20"/>
+      <w:color w:val="000000"/>
+      <w:sz w:val="22"/>
     </w:rPr>
   </w:style>
   <w:style w:type="paragraph" w:styleId="Header">
@@ -1125,6 +1131,11 @@
       </w:tabs>
       <w:spacing w:after="0" w:line="240" w:lineRule="auto"/>
     </w:pPr>
+    <w:rPr>
+      <w:rFonts w:ascii="Arial" w:hAnsi="Arial"/>
+      <w:color w:val="555555"/>
+      <w:sz w:val="16"/>
+    </w:rPr>
   </w:style>
   <w:style w:type="character" w:customStyle="1" w:styleId="FooterChar">
     <w:name w:val="Footer Char"/>
@@ -1144,15 +1155,16 @@
     <w:pPr>
       <w:keepNext/>
       <w:keepLines/>
-      <w:spacing w:before="160" w:after="60"/>
+      <w:spacing w:before="180" w:after="60" w:line="259" w:lineRule="auto"/>
       <w:outlineLvl w:val="0"/>
     </w:pPr>
     <w:rPr>
       <w:rFonts w:asciiTheme="majorHAnsi" w:eastAsiaTheme="majorEastAsia" w:hAnsiTheme="majorHAnsi" w:cstheme="majorBidi" w:ascii="Arial" w:hAnsi="Arial"/>
       <w:b/>
       <w:bCs/>
+      <w:i w:val="0"/>
       <w:color w:val="000000"/>
-      <w:sz w:val="22"/>
+      <w:sz w:val="23"/>
       <w:szCs w:val="28"/>
     </w:rPr>
   </w:style>
@@ -1168,15 +1180,16 @@
     <w:pPr>
       <w:keepNext/>
       <w:keepLines/>
-      <w:spacing w:before="80" w:after="60"/>
+      <w:spacing w:before="0" w:after="60" w:line="259" w:lineRule="auto"/>
       <w:outlineLvl w:val="1"/>
     </w:pPr>
     <w:rPr>
       <w:rFonts w:asciiTheme="majorHAnsi" w:eastAsiaTheme="majorEastAsia" w:hAnsiTheme="majorHAnsi" w:cstheme="majorBidi" w:ascii="Arial" w:hAnsi="Arial"/>
       <w:b/>
       <w:bCs/>
+      <w:i w:val="0"/>
       <w:color w:val="000000"/>
-      <w:sz w:val="21"/>
+      <w:sz w:val="22"/>
       <w:szCs w:val="26"/>
     </w:rPr>
   </w:style>
@@ -1430,16 +1443,18 @@
     <w:qFormat/>
     <w:rsid w:val="00FC693F"/>
     <w:pPr>
-      <w:spacing w:after="60" w:line="240" w:lineRule="auto"/>
+      <w:keepNext/>
+      <w:spacing w:after="60" w:line="259" w:lineRule="auto" w:before="0"/>
       <w:contextualSpacing/>
     </w:pPr>
     <w:rPr>
       <w:rFonts w:asciiTheme="majorHAnsi" w:eastAsiaTheme="majorEastAsia" w:hAnsiTheme="majorHAnsi" w:cstheme="majorBidi" w:ascii="Arial" w:hAnsi="Arial"/>
       <w:b/>
+      <w:i w:val="0"/>
       <w:color w:val="000000"/>
       <w:spacing w:val="5"/>
       <w:kern w:val="28"/>
-      <w:sz w:val="52"/>
+      <w:sz w:val="50"/>
       <w:szCs w:val="52"/>
     </w:rPr>
   </w:style>
@@ -1467,10 +1482,11 @@
     <w:qFormat/>
     <w:rsid w:val="00FC693F"/>
     <w:pPr>
+      <w:keepNext/>
       <w:numPr>
         <w:ilvl w:val="1"/>
       </w:numPr>
-      <w:spacing w:after="120"/>
+      <w:spacing w:after="60" w:before="0" w:line="259" w:lineRule="auto"/>
     </w:pPr>
     <w:rPr>
       <w:rFonts w:asciiTheme="majorHAnsi" w:eastAsiaTheme="majorEastAsia" w:hAnsiTheme="majorHAnsi" w:cstheme="majorBidi" w:ascii="Arial" w:hAnsi="Arial"/>
@@ -1615,8 +1631,16 @@
       <w:numPr>
         <w:numId w:val="1"/>
       </w:numPr>
+      <w:spacing w:after="60" w:line="284" w:lineRule="exact"/>
+      <w:ind w:left="187" w:hanging="187"/>
       <w:contextualSpacing/>
     </w:pPr>
+    <w:rPr>
+      <w:rFonts w:ascii="Arial" w:hAnsi="Arial"/>
+      <w:i w:val="0"/>
+      <w:color w:val="000000"/>
+      <w:sz w:val="22"/>
+    </w:rPr>
   </w:style>
   <w:style w:type="paragraph" w:styleId="ListBullet2">
     <w:name w:val="List Bullet 2"/>

</xml_diff>